<commit_message>
Replace uninformative all-ones parity table with a meaningful presentation
A table whose every cell was a Jaccard overlap of 1.000 conveyed nothing. Instead:
- State the item-level result in prose with the concrete count: across the four
  demonstrations all 216 selected (word, condition) pairs are identical between
  the R and Python engines.
- Add a side-by-side table for the English frequency contrast showing each
  dimension's Cohen's d computed independently by the two engines (4.67 vs 0.00
  vs 0.06 vs 0.01), demonstrating that the columns coincide rather than asserting
  a column of ones.
Re-rendered to HTML and docx.

Co-Authored-By: Claude Opus 4.8 <noreply@anthropic.com>
</commit_message>
<xml_diff>
--- a/manuscript/manuscript.docx
+++ b/manuscript/manuscript.docx
@@ -4429,7 +4429,31 @@
         <w:pStyle w:val="BodyText"/>
       </w:pPr>
       <w:r>
-        <w:t xml:space="preserve">Finally,</w:t>
+        <w:t xml:space="preserve">Finally, because the matcher is deterministic the two engines return the same</w:t>
+      </w:r>
+      <w:r>
+        <w:t xml:space="preserve"> </w:t>
+      </w:r>
+      <w:r>
+        <w:t xml:space="preserve">stimuli rather than merely similar ones. Across the four demonstrations</w:t>
+      </w:r>
+      <w:r>
+        <w:t xml:space="preserve"> </w:t>
+      </w:r>
+      <w:r>
+        <w:t xml:space="preserve">all 216 of the selected</w:t>
+      </w:r>
+      <w:r>
+        <w:t xml:space="preserve"> </w:t>
+      </w:r>
+      <w:r>
+        <w:t xml:space="preserve">(word, condition) pairs were identical between the R and the Python engine, and</w:t>
+      </w:r>
+      <w:r>
+        <w:t xml:space="preserve"> </w:t>
+      </w:r>
+      <w:r>
+        <w:t xml:space="preserve">every statistic they report agrees to the precision shown.</w:t>
       </w:r>
       <w:r>
         <w:t xml:space="preserve"> </w:t>
@@ -4446,31 +4470,19 @@
         <w:t xml:space="preserve"> </w:t>
       </w:r>
       <w:r>
-        <w:t xml:space="preserve">reports the cross-engine parity: for each demonstration we</w:t>
-      </w:r>
-      <w:r>
-        <w:t xml:space="preserve"> </w:t>
-      </w:r>
-      <w:r>
-        <w:t xml:space="preserve">compare the set of (word, condition) pairs selected by the R engine with those</w:t>
-      </w:r>
-      <w:r>
-        <w:t xml:space="preserve"> </w:t>
-      </w:r>
-      <w:r>
-        <w:t xml:space="preserve">selected by the Python engine. The overlap is complete in every case, confirming</w:t>
-      </w:r>
-      <w:r>
-        <w:t xml:space="preserve"> </w:t>
-      </w:r>
-      <w:r>
-        <w:t xml:space="preserve">that the two independent implementations realise the same deterministic</w:t>
-      </w:r>
-      <w:r>
-        <w:t xml:space="preserve"> </w:t>
-      </w:r>
-      <w:r>
-        <w:t xml:space="preserve">procedure.</w:t>
+        <w:t xml:space="preserve">makes this</w:t>
+      </w:r>
+      <w:r>
+        <w:t xml:space="preserve"> </w:t>
+      </w:r>
+      <w:r>
+        <w:t xml:space="preserve">concrete for the English frequency contrast: the standardised mean difference of</w:t>
+      </w:r>
+      <w:r>
+        <w:t xml:space="preserve"> </w:t>
+      </w:r>
+      <w:r>
+        <w:t xml:space="preserve">each dimension, computed independently in the two languages, coincides exactly.</w:t>
       </w:r>
     </w:p>
     <w:tbl>
@@ -4497,7 +4509,7 @@
               <w:pStyle w:val="ImageCaption"/>
             </w:pPr>
             <w:r>
-              <w:t xml:space="preserve">Table 4: Cross-engine parity: Jaccard overlap between the stimuli selected by the R and Python engines.</w:t>
+              <w:t xml:space="preserve">Table 4: Cross-engine parity for the English frequency contrast. Each dimension’s standardised mean difference against the anchor, computed independently by the R engine and the Python engine. The columns are identical to three decimal places.</w:t>
             </w:r>
           </w:p>
           <w:tbl>
@@ -4507,8 +4519,9 @@
               <w:tblLook w:firstRow="1" w:lastRow="0" w:firstColumn="0" w:lastColumn="0" w:noHBand="0" w:noVBand="0" w:val="0020"/>
             </w:tblPr>
             <w:tblGrid>
-              <w:gridCol w:w="3960"/>
-              <w:gridCol w:w="3960"/>
+              <w:gridCol w:w="2640"/>
+              <w:gridCol w:w="2640"/>
+              <w:gridCol w:w="2640"/>
             </w:tblGrid>
             <w:tr>
               <w:trPr>
@@ -4523,20 +4536,33 @@
                     <w:jc w:val="center"/>
                   </w:pPr>
                   <w:r>
-                    <w:t xml:space="preserve">Demonstration</w:t>
-                  </w:r>
-                </w:p>
-              </w:tc>
-              <w:tc>
-                <w:tcPr/>
-                <w:p>
-                  <w:pPr>
-                    <w:pStyle w:val="Compact"/>
-                    <w:jc w:val="right"/>
-                    <w:jc w:val="center"/>
-                  </w:pPr>
-                  <w:r>
-                    <w:t xml:space="preserve">Jaccard overlap</w:t>
+                    <w:t xml:space="preserve">Dimension</w:t>
+                  </w:r>
+                </w:p>
+              </w:tc>
+              <w:tc>
+                <w:tcPr/>
+                <w:p>
+                  <w:pPr>
+                    <w:pStyle w:val="Compact"/>
+                    <w:jc w:val="right"/>
+                    <w:jc w:val="center"/>
+                  </w:pPr>
+                  <w:r>
+                    <w:t xml:space="preserve">Cohen’s d (R engine)</w:t>
+                  </w:r>
+                </w:p>
+              </w:tc>
+              <w:tc>
+                <w:tcPr/>
+                <w:p>
+                  <w:pPr>
+                    <w:pStyle w:val="Compact"/>
+                    <w:jc w:val="right"/>
+                    <w:jc w:val="center"/>
+                  </w:pPr>
+                  <w:r>
+                    <w:t xml:space="preserve">Cohen’s d (Python engine)</w:t>
                   </w:r>
                 </w:p>
               </w:tc>
@@ -4551,20 +4577,33 @@
                     <w:jc w:val="center"/>
                   </w:pPr>
                   <w:r>
-                    <w:t xml:space="preserve">English: frequency contrast</w:t>
-                  </w:r>
-                </w:p>
-              </w:tc>
-              <w:tc>
-                <w:tcPr/>
-                <w:p>
-                  <w:pPr>
-                    <w:pStyle w:val="Compact"/>
-                    <w:jc w:val="right"/>
-                    <w:jc w:val="center"/>
-                  </w:pPr>
-                  <w:r>
-                    <w:t xml:space="preserve">1</w:t>
+                    <w:t xml:space="preserve">Length (letters)</w:t>
+                  </w:r>
+                </w:p>
+              </w:tc>
+              <w:tc>
+                <w:tcPr/>
+                <w:p>
+                  <w:pPr>
+                    <w:pStyle w:val="Compact"/>
+                    <w:jc w:val="right"/>
+                    <w:jc w:val="center"/>
+                  </w:pPr>
+                  <w:r>
+                    <w:t xml:space="preserve">0.000</w:t>
+                  </w:r>
+                </w:p>
+              </w:tc>
+              <w:tc>
+                <w:tcPr/>
+                <w:p>
+                  <w:pPr>
+                    <w:pStyle w:val="Compact"/>
+                    <w:jc w:val="right"/>
+                    <w:jc w:val="center"/>
+                  </w:pPr>
+                  <w:r>
+                    <w:t xml:space="preserve">0.000</w:t>
                   </w:r>
                 </w:p>
               </w:tc>
@@ -4579,20 +4618,33 @@
                     <w:jc w:val="center"/>
                   </w:pPr>
                   <w:r>
-                    <w:t xml:space="preserve">English: neighbourhood contrast</w:t>
-                  </w:r>
-                </w:p>
-              </w:tc>
-              <w:tc>
-                <w:tcPr/>
-                <w:p>
-                  <w:pPr>
-                    <w:pStyle w:val="Compact"/>
-                    <w:jc w:val="right"/>
-                    <w:jc w:val="center"/>
-                  </w:pPr>
-                  <w:r>
-                    <w:t xml:space="preserve">1</w:t>
+                    <w:t xml:space="preserve">Frequency (Zipf)</w:t>
+                  </w:r>
+                </w:p>
+              </w:tc>
+              <w:tc>
+                <w:tcPr/>
+                <w:p>
+                  <w:pPr>
+                    <w:pStyle w:val="Compact"/>
+                    <w:jc w:val="right"/>
+                    <w:jc w:val="center"/>
+                  </w:pPr>
+                  <w:r>
+                    <w:t xml:space="preserve">4.670</w:t>
+                  </w:r>
+                </w:p>
+              </w:tc>
+              <w:tc>
+                <w:tcPr/>
+                <w:p>
+                  <w:pPr>
+                    <w:pStyle w:val="Compact"/>
+                    <w:jc w:val="right"/>
+                    <w:jc w:val="center"/>
+                  </w:pPr>
+                  <w:r>
+                    <w:t xml:space="preserve">4.670</w:t>
                   </w:r>
                 </w:p>
               </w:tc>
@@ -4607,20 +4659,33 @@
                     <w:jc w:val="center"/>
                   </w:pPr>
                   <w:r>
-                    <w:t xml:space="preserve">Spanish: frequency contrast</w:t>
-                  </w:r>
-                </w:p>
-              </w:tc>
-              <w:tc>
-                <w:tcPr/>
-                <w:p>
-                  <w:pPr>
-                    <w:pStyle w:val="Compact"/>
-                    <w:jc w:val="right"/>
-                    <w:jc w:val="center"/>
-                  </w:pPr>
-                  <w:r>
-                    <w:t xml:space="preserve">1</w:t>
+                    <w:t xml:space="preserve">Neighbourhood N</w:t>
+                  </w:r>
+                </w:p>
+              </w:tc>
+              <w:tc>
+                <w:tcPr/>
+                <w:p>
+                  <w:pPr>
+                    <w:pStyle w:val="Compact"/>
+                    <w:jc w:val="right"/>
+                    <w:jc w:val="center"/>
+                  </w:pPr>
+                  <w:r>
+                    <w:t xml:space="preserve">0.058</w:t>
+                  </w:r>
+                </w:p>
+              </w:tc>
+              <w:tc>
+                <w:tcPr/>
+                <w:p>
+                  <w:pPr>
+                    <w:pStyle w:val="Compact"/>
+                    <w:jc w:val="right"/>
+                    <w:jc w:val="center"/>
+                  </w:pPr>
+                  <w:r>
+                    <w:t xml:space="preserve">0.058</w:t>
                   </w:r>
                 </w:p>
               </w:tc>
@@ -4635,20 +4700,33 @@
                     <w:jc w:val="center"/>
                   </w:pPr>
                   <w:r>
-                    <w:t xml:space="preserve">Spanish: neighbourhood contrast</w:t>
-                  </w:r>
-                </w:p>
-              </w:tc>
-              <w:tc>
-                <w:tcPr/>
-                <w:p>
-                  <w:pPr>
-                    <w:pStyle w:val="Compact"/>
-                    <w:jc w:val="right"/>
-                    <w:jc w:val="center"/>
-                  </w:pPr>
-                  <w:r>
-                    <w:t xml:space="preserve">1</w:t>
+                    <w:t xml:space="preserve">OLD20</w:t>
+                  </w:r>
+                </w:p>
+              </w:tc>
+              <w:tc>
+                <w:tcPr/>
+                <w:p>
+                  <w:pPr>
+                    <w:pStyle w:val="Compact"/>
+                    <w:jc w:val="right"/>
+                    <w:jc w:val="center"/>
+                  </w:pPr>
+                  <w:r>
+                    <w:t xml:space="preserve">0.007</w:t>
+                  </w:r>
+                </w:p>
+              </w:tc>
+              <w:tc>
+                <w:tcPr/>
+                <w:p>
+                  <w:pPr>
+                    <w:pStyle w:val="Compact"/>
+                    <w:jc w:val="right"/>
+                    <w:jc w:val="center"/>
+                  </w:pPr>
+                  <w:r>
+                    <w:t xml:space="preserve">0.007</w:t>
                   </w:r>
                 </w:p>
               </w:tc>

</xml_diff>

<commit_message>
Add APA 7 citations and PDF output to the manuscript
- Add APA 7th edition CSL (apa.csl) and reference it via csl:; citations now
  render APA style both in-text and in the reference list (verified against the
  rendered text: "(Wilkinson et al., 2016)", "Taylor, J. E., Beith, A., &
  Sereno, S. C. (2020).").
- Add a pdf output format using xelatex (for accented author names); TinyTeX
  installed. The manuscript now renders to HTML, PDF and docx.
- Mark *.pdf binary in .gitattributes.

Co-Authored-By: Claude Opus 4.8 <noreply@anthropic.com>
</commit_message>
<xml_diff>
--- a/manuscript/manuscript.docx
+++ b/manuscript/manuscript.docx
@@ -281,10 +281,7 @@
         <w:t xml:space="preserve">Wilkinson et al.</w:t>
       </w:r>
       <w:r>
-        <w:t xml:space="preserve"> </w:t>
-      </w:r>
-      <w:r>
-        <w:t xml:space="preserve">2016)</w:t>
+        <w:t xml:space="preserve">, 2016)</w:t>
       </w:r>
       <w:r>
         <w:t xml:space="preserve"> </w:t>
@@ -334,7 +331,7 @@
         <w:t xml:space="preserve"> </w:t>
       </w:r>
       <w:r>
-        <w:t xml:space="preserve">(Taylor et al. 2020)</w:t>
+        <w:t xml:space="preserve">(Taylor et al., 2020)</w:t>
       </w:r>
       <w:r>
         <w:t xml:space="preserve"> </w:t>
@@ -364,7 +361,7 @@
         <w:t xml:space="preserve"> </w:t>
       </w:r>
       <w:r>
-        <w:t xml:space="preserve">(Lintz et al. 2021)</w:t>
+        <w:t xml:space="preserve">(Lintz et al., 2021)</w:t>
       </w:r>
       <w:r>
         <w:t xml:space="preserve"> </w:t>
@@ -388,7 +385,7 @@
         <w:t xml:space="preserve"> </w:t>
       </w:r>
       <w:r>
-        <w:t xml:space="preserve">(Itkonen et al. 2024)</w:t>
+        <w:t xml:space="preserve">(Itkonen et al., 2024)</w:t>
       </w:r>
       <w:r>
         <w:t xml:space="preserve"> </w:t>
@@ -430,7 +427,7 @@
         <w:t xml:space="preserve"> </w:t>
       </w:r>
       <w:r>
-        <w:t xml:space="preserve">(Peirce et al. 2019)</w:t>
+        <w:t xml:space="preserve">(Peirce et al., 2019)</w:t>
       </w:r>
       <w:r>
         <w:t xml:space="preserve"> </w:t>
@@ -448,7 +445,7 @@
         <w:t xml:space="preserve"> </w:t>
       </w:r>
       <w:r>
-        <w:t xml:space="preserve">(Mathôt et al. 2012)</w:t>
+        <w:t xml:space="preserve">(Mathôt et al., 2012)</w:t>
       </w:r>
       <w:r>
         <w:t xml:space="preserve"> </w:t>
@@ -510,7 +507,7 @@
         <w:t xml:space="preserve"> </w:t>
       </w:r>
       <w:r>
-        <w:t xml:space="preserve">(González Alonso et al. 2025)</w:t>
+        <w:t xml:space="preserve">(González Alonso et al., 2025)</w:t>
       </w:r>
       <w:r>
         <w:t xml:space="preserve">, EEG markers were sent from an experiment item that</w:t>
@@ -1007,7 +1004,7 @@
         <w:t xml:space="preserve"> </w:t>
       </w:r>
       <w:r>
-        <w:t xml:space="preserve">(Heuven et al. 2014)</w:t>
+        <w:t xml:space="preserve">(Heuven et al., 2014)</w:t>
       </w:r>
       <w:r>
         <w:t xml:space="preserve">, SUBTLEX-ESP for Spanish</w:t>
@@ -1016,7 +1013,7 @@
         <w:t xml:space="preserve"> </w:t>
       </w:r>
       <w:r>
-        <w:t xml:space="preserve">(Cuetos et al. 2011)</w:t>
+        <w:t xml:space="preserve">(Cuetos et al., 2011)</w:t>
       </w:r>
       <w:r>
         <w:t xml:space="preserve"> </w:t>
@@ -1028,7 +1025,7 @@
         <w:t xml:space="preserve"> </w:t>
       </w:r>
       <w:r>
-        <w:t xml:space="preserve">(Brysbaert and New 2009)</w:t>
+        <w:t xml:space="preserve">(Brysbaert &amp; New, 2009)</w:t>
       </w:r>
       <w:r>
         <w:t xml:space="preserve"> </w:t>
@@ -1058,7 +1055,7 @@
         <w:t xml:space="preserve"> </w:t>
       </w:r>
       <w:r>
-        <w:t xml:space="preserve">(Speer 2022)</w:t>
+        <w:t xml:space="preserve">(Speer, 2022)</w:t>
       </w:r>
       <w:r>
         <w:t xml:space="preserve">, which yields frequencies for roughly</w:t>
@@ -1154,7 +1151,7 @@
         <w:t xml:space="preserve"> </w:t>
       </w:r>
       <w:r>
-        <w:t xml:space="preserve">(Coltheart et al. 1977)</w:t>
+        <w:t xml:space="preserve">(Coltheart et al., 1977)</w:t>
       </w:r>
       <w:r>
         <w:t xml:space="preserve">, and OLD20, the</w:t>
@@ -1169,7 +1166,7 @@
         <w:t xml:space="preserve"> </w:t>
       </w:r>
       <w:r>
-        <w:t xml:space="preserve">(Yarkoni et al. 2008)</w:t>
+        <w:t xml:space="preserve">(Yarkoni et al., 2008)</w:t>
       </w:r>
       <w:r>
         <w:t xml:space="preserve">.</w:t>
@@ -1321,7 +1318,7 @@
         <w:t xml:space="preserve"> </w:t>
       </w:r>
       <w:r>
-        <w:t xml:space="preserve">(Lakens 2017)</w:t>
+        <w:t xml:space="preserve">(Lakens, 2017)</w:t>
       </w:r>
       <w:r>
         <w:t xml:space="preserve"> </w:t>
@@ -5164,13 +5161,7 @@
         <w:pStyle w:val="Bibliography"/>
       </w:pPr>
       <w:r>
-        <w:t xml:space="preserve">Brysbaert, Marc, and Boris New. 2009.</w:t>
-      </w:r>
-      <w:r>
-        <w:t xml:space="preserve"> </w:t>
-      </w:r>
-      <w:r>
-        <w:t xml:space="preserve">“Moving Beyond</w:t>
+        <w:t xml:space="preserve">Brysbaert, M., &amp; New, B. (2009). Moving beyond</w:t>
       </w:r>
       <w:r>
         <w:t xml:space="preserve"> </w:t>
@@ -5197,7 +5188,7 @@
         <w:t xml:space="preserve">Francis</w:t>
       </w:r>
       <w:r>
-        <w:t xml:space="preserve">: A Critical Evaluation of Current Word Frequency Norms and the Introduction of a New and Improved Word Frequency Measure for</w:t>
+        <w:t xml:space="preserve">: A critical evaluation of current word frequency norms and the introduction of a new and improved word frequency measure for</w:t>
       </w:r>
       <w:r>
         <w:t xml:space="preserve"> </w:t>
@@ -5212,7 +5203,7 @@
         <w:t xml:space="preserve">English</w:t>
       </w:r>
       <w:r>
-        <w:t xml:space="preserve">.”</w:t>
+        <w:t xml:space="preserve">.</w:t>
       </w:r>
       <w:r>
         <w:t xml:space="preserve"> </w:t>
@@ -5225,10 +5216,20 @@
         <w:t xml:space="preserve">Behavior Research Methods</w:t>
       </w:r>
       <w:r>
-        <w:t xml:space="preserve"> </w:t>
-      </w:r>
-      <w:r>
-        <w:t xml:space="preserve">41 (4): 977–90.</w:t>
+        <w:t xml:space="preserve">,</w:t>
+      </w:r>
+      <w:r>
+        <w:t xml:space="preserve"> </w:t>
+      </w:r>
+      <w:r>
+        <w:rPr>
+          <w:i/>
+          <w:iCs/>
+        </w:rPr>
+        <w:t xml:space="preserve">41</w:t>
+      </w:r>
+      <w:r>
+        <w:t xml:space="preserve">(4), 977–990.</w:t>
       </w:r>
       <w:r>
         <w:t xml:space="preserve"> </w:t>
@@ -5241,9 +5242,6 @@
           <w:t xml:space="preserve">https://doi.org/10.3758/BRM.41.4.977</w:t>
         </w:r>
       </w:hyperlink>
-      <w:r>
-        <w:t xml:space="preserve">.</w:t>
-      </w:r>
     </w:p>
     <w:bookmarkEnd w:id="30"/>
     <w:bookmarkStart w:id="31" w:name="ref-coltheart1977access"/>
@@ -5252,19 +5250,7 @@
         <w:pStyle w:val="Bibliography"/>
       </w:pPr>
       <w:r>
-        <w:t xml:space="preserve">Coltheart, Max, Eileen Davelaar, Jon Torfi Jonasson, and Derek Besner. 1977.</w:t>
-      </w:r>
-      <w:r>
-        <w:t xml:space="preserve"> </w:t>
-      </w:r>
-      <w:r>
-        <w:t xml:space="preserve">“Access to the Internal Lexicon.”</w:t>
-      </w:r>
-      <w:r>
-        <w:t xml:space="preserve"> </w:t>
-      </w:r>
-      <w:r>
-        <w:t xml:space="preserve">In</w:t>
+        <w:t xml:space="preserve">Coltheart, M., Davelaar, E., Jonasson, J. T., &amp; Besner, D. (1977). Access to the internal lexicon. In S. Dornic (Ed.),</w:t>
       </w:r>
       <w:r>
         <w:t xml:space="preserve"> </w:t>
@@ -5274,7 +5260,7 @@
           <w:i/>
           <w:iCs/>
         </w:rPr>
-        <w:t xml:space="preserve">Attention and Performance</w:t>
+        <w:t xml:space="preserve">Attention and performance</w:t>
       </w:r>
       <w:r>
         <w:rPr>
@@ -5291,7 +5277,10 @@
         <w:t xml:space="preserve">VI</w:t>
       </w:r>
       <w:r>
-        <w:t xml:space="preserve">, edited by Stanislav Dornic. Erlbaum.</w:t>
+        <w:t xml:space="preserve"> </w:t>
+      </w:r>
+      <w:r>
+        <w:t xml:space="preserve">(pp. 535–555). Erlbaum.</w:t>
       </w:r>
     </w:p>
     <w:bookmarkEnd w:id="31"/>
@@ -5301,13 +5290,10 @@
         <w:pStyle w:val="Bibliography"/>
       </w:pPr>
       <w:r>
-        <w:t xml:space="preserve">Cuetos, Fernando, María González-Nosti, Analía Barbón, and Marc Brysbaert. 2011.</w:t>
-      </w:r>
-      <w:r>
-        <w:t xml:space="preserve"> </w:t>
-      </w:r>
-      <w:r>
-        <w:t xml:space="preserve">“</w:t>
+        <w:t xml:space="preserve">Cuetos, F., González-Nosti, M., Barbón, A., &amp; Brysbaert, M. (2011).</w:t>
+      </w:r>
+      <w:r>
+        <w:t xml:space="preserve"> </w:t>
       </w:r>
       <w:r>
         <w:t xml:space="preserve">SUBTLEX-ESP</w:t>
@@ -5325,7 +5311,7 @@
         <w:t xml:space="preserve"> </w:t>
       </w:r>
       <w:r>
-        <w:t xml:space="preserve">Word Frequencies Based on Film Subtitles.”</w:t>
+        <w:t xml:space="preserve">word frequencies based on film subtitles.</w:t>
       </w:r>
       <w:r>
         <w:t xml:space="preserve"> </w:t>
@@ -5352,10 +5338,20 @@
         <w:t xml:space="preserve">logica</w:t>
       </w:r>
       <w:r>
-        <w:t xml:space="preserve"> </w:t>
-      </w:r>
-      <w:r>
-        <w:t xml:space="preserve">32 (2): 133–43.</w:t>
+        <w:t xml:space="preserve">,</w:t>
+      </w:r>
+      <w:r>
+        <w:t xml:space="preserve"> </w:t>
+      </w:r>
+      <w:r>
+        <w:rPr>
+          <w:i/>
+          <w:iCs/>
+        </w:rPr>
+        <w:t xml:space="preserve">32</w:t>
+      </w:r>
+      <w:r>
+        <w:t xml:space="preserve">(2), 133–143.</w:t>
       </w:r>
     </w:p>
     <w:bookmarkEnd w:id="32"/>
@@ -5365,19 +5361,13 @@
         <w:pStyle w:val="Bibliography"/>
       </w:pPr>
       <w:r>
-        <w:t xml:space="preserve">González Alonso, Jorge, Pablo Bernabeu, Gabriella Silva, et al. 2025.</w:t>
-      </w:r>
-      <w:r>
-        <w:t xml:space="preserve"> </w:t>
-      </w:r>
-      <w:r>
-        <w:t xml:space="preserve">“Starting from the Very Beginning: Unraveling Third Language (</w:t>
+        <w:t xml:space="preserve">González Alonso, J., Bernabeu, P., Silva, G., DeLuca, V., Poch, C., Ivanova, I., &amp; Rothman, J. (2025). Starting from the very beginning: Unraveling third language (</w:t>
       </w:r>
       <w:r>
         <w:t xml:space="preserve">L3</w:t>
       </w:r>
       <w:r>
-        <w:t xml:space="preserve">) Development with Longitudinal Data from Artificial Language Learning and</w:t>
+        <w:t xml:space="preserve">) development with longitudinal data from artificial language learning and</w:t>
       </w:r>
       <w:r>
         <w:t xml:space="preserve"> </w:t>
@@ -5386,7 +5376,7 @@
         <w:t xml:space="preserve">EEG</w:t>
       </w:r>
       <w:r>
-        <w:t xml:space="preserve">.”</w:t>
+        <w:t xml:space="preserve">.</w:t>
       </w:r>
       <w:r>
         <w:t xml:space="preserve"> </w:t>
@@ -5399,10 +5389,20 @@
         <w:t xml:space="preserve">International Journal of Multilingualism</w:t>
       </w:r>
       <w:r>
-        <w:t xml:space="preserve"> </w:t>
-      </w:r>
-      <w:r>
-        <w:t xml:space="preserve">22 (1): 119–42.</w:t>
+        <w:t xml:space="preserve">,</w:t>
+      </w:r>
+      <w:r>
+        <w:t xml:space="preserve"> </w:t>
+      </w:r>
+      <w:r>
+        <w:rPr>
+          <w:i/>
+          <w:iCs/>
+        </w:rPr>
+        <w:t xml:space="preserve">22</w:t>
+      </w:r>
+      <w:r>
+        <w:t xml:space="preserve">(1), 119–142.</w:t>
       </w:r>
       <w:r>
         <w:t xml:space="preserve"> </w:t>
@@ -5415,9 +5415,6 @@
           <w:t xml:space="preserve">https://doi.org/10.1080/14790718.2024.2415993</w:t>
         </w:r>
       </w:hyperlink>
-      <w:r>
-        <w:t xml:space="preserve">.</w:t>
-      </w:r>
     </w:p>
     <w:bookmarkEnd w:id="34"/>
     <w:bookmarkStart w:id="36" w:name="ref-vanheuven2014subtlexuk"/>
@@ -5426,19 +5423,16 @@
         <w:pStyle w:val="Bibliography"/>
       </w:pPr>
       <w:r>
-        <w:t xml:space="preserve">Heuven, Walter J. B. van, Pawel Mandera, Emmanuel Keuleers, and Marc Brysbaert. 2014.</w:t>
-      </w:r>
-      <w:r>
-        <w:t xml:space="preserve"> </w:t>
-      </w:r>
-      <w:r>
-        <w:t xml:space="preserve">“</w:t>
+        <w:t xml:space="preserve">Heuven, W. J. B. van, Mandera, P., Keuleers, E., &amp; Brysbaert, M. (2014).</w:t>
+      </w:r>
+      <w:r>
+        <w:t xml:space="preserve"> </w:t>
       </w:r>
       <w:r>
         <w:t xml:space="preserve">SUBTLEX-UK</w:t>
       </w:r>
       <w:r>
-        <w:t xml:space="preserve">: A New and Improved Word Frequency Database for</w:t>
+        <w:t xml:space="preserve">: A new and improved word frequency database for</w:t>
       </w:r>
       <w:r>
         <w:t xml:space="preserve"> </w:t>
@@ -5453,7 +5447,7 @@
         <w:t xml:space="preserve">English</w:t>
       </w:r>
       <w:r>
-        <w:t xml:space="preserve">.”</w:t>
+        <w:t xml:space="preserve">.</w:t>
       </w:r>
       <w:r>
         <w:t xml:space="preserve"> </w:t>
@@ -5466,10 +5460,20 @@
         <w:t xml:space="preserve">Quarterly Journal of Experimental Psychology</w:t>
       </w:r>
       <w:r>
-        <w:t xml:space="preserve"> </w:t>
-      </w:r>
-      <w:r>
-        <w:t xml:space="preserve">67 (6): 1176–90.</w:t>
+        <w:t xml:space="preserve">,</w:t>
+      </w:r>
+      <w:r>
+        <w:t xml:space="preserve"> </w:t>
+      </w:r>
+      <w:r>
+        <w:rPr>
+          <w:i/>
+          <w:iCs/>
+        </w:rPr>
+        <w:t xml:space="preserve">67</w:t>
+      </w:r>
+      <w:r>
+        <w:t xml:space="preserve">(6), 1176–1190.</w:t>
       </w:r>
       <w:r>
         <w:t xml:space="preserve"> </w:t>
@@ -5482,9 +5486,6 @@
           <w:t xml:space="preserve">https://doi.org/10.1080/17470218.2013.850521</w:t>
         </w:r>
       </w:hyperlink>
-      <w:r>
-        <w:t xml:space="preserve">.</w:t>
-      </w:r>
     </w:p>
     <w:bookmarkEnd w:id="36"/>
     <w:bookmarkStart w:id="38" w:name="ref-itkonen2024lastu"/>
@@ -5493,19 +5494,16 @@
         <w:pStyle w:val="Bibliography"/>
       </w:pPr>
       <w:r>
-        <w:t xml:space="preserve">Itkonen, Sami, Tuomo Häikiö, Seppo Vainio, and Minna Lehtonen. 2024.</w:t>
-      </w:r>
-      <w:r>
-        <w:t xml:space="preserve"> </w:t>
-      </w:r>
-      <w:r>
-        <w:t xml:space="preserve">“</w:t>
+        <w:t xml:space="preserve">Itkonen, S., Häikiö, T., Vainio, S., &amp; Lehtonen, M. (2024).</w:t>
+      </w:r>
+      <w:r>
+        <w:t xml:space="preserve"> </w:t>
       </w:r>
       <w:r>
         <w:t xml:space="preserve">LASTU</w:t>
       </w:r>
       <w:r>
-        <w:t xml:space="preserve">: A Psycholinguistic Search Tool for</w:t>
+        <w:t xml:space="preserve">: A psycholinguistic search tool for</w:t>
       </w:r>
       <w:r>
         <w:t xml:space="preserve"> </w:t>
@@ -5517,7 +5515,7 @@
         <w:t xml:space="preserve"> </w:t>
       </w:r>
       <w:r>
-        <w:t xml:space="preserve">Lexical Stimuli.”</w:t>
+        <w:t xml:space="preserve">lexical stimuli.</w:t>
       </w:r>
       <w:r>
         <w:t xml:space="preserve"> </w:t>
@@ -5530,10 +5528,20 @@
         <w:t xml:space="preserve">Behavior Research Methods</w:t>
       </w:r>
       <w:r>
-        <w:t xml:space="preserve"> </w:t>
-      </w:r>
-      <w:r>
-        <w:t xml:space="preserve">56 (6): 6165–78.</w:t>
+        <w:t xml:space="preserve">,</w:t>
+      </w:r>
+      <w:r>
+        <w:t xml:space="preserve"> </w:t>
+      </w:r>
+      <w:r>
+        <w:rPr>
+          <w:i/>
+          <w:iCs/>
+        </w:rPr>
+        <w:t xml:space="preserve">56</w:t>
+      </w:r>
+      <w:r>
+        <w:t xml:space="preserve">(6), 6165–6178.</w:t>
       </w:r>
       <w:r>
         <w:t xml:space="preserve"> </w:t>
@@ -5546,9 +5554,6 @@
           <w:t xml:space="preserve">https://doi.org/10.3758/s13428-024-02347-x</w:t>
         </w:r>
       </w:hyperlink>
-      <w:r>
-        <w:t xml:space="preserve">.</w:t>
-      </w:r>
     </w:p>
     <w:bookmarkEnd w:id="38"/>
     <w:bookmarkStart w:id="40" w:name="ref-lakens2017equivalence"/>
@@ -5557,13 +5562,7 @@
         <w:pStyle w:val="Bibliography"/>
       </w:pPr>
       <w:r>
-        <w:t xml:space="preserve">Lakens, Daniël. 2017.</w:t>
-      </w:r>
-      <w:r>
-        <w:t xml:space="preserve"> </w:t>
-      </w:r>
-      <w:r>
-        <w:t xml:space="preserve">“Equivalence Tests: A Practical Primer for</w:t>
+        <w:t xml:space="preserve">Lakens, D. (2017). Equivalence tests: A practical primer for</w:t>
       </w:r>
       <w:r>
         <w:t xml:space="preserve"> </w:t>
@@ -5575,7 +5574,7 @@
         <w:t xml:space="preserve"> </w:t>
       </w:r>
       <w:r>
-        <w:t xml:space="preserve">Tests, Correlations, and Meta-Analyses.”</w:t>
+        <w:t xml:space="preserve">tests, correlations, and meta-analyses.</w:t>
       </w:r>
       <w:r>
         <w:t xml:space="preserve"> </w:t>
@@ -5588,10 +5587,20 @@
         <w:t xml:space="preserve">Social Psychological and Personality Science</w:t>
       </w:r>
       <w:r>
-        <w:t xml:space="preserve"> </w:t>
-      </w:r>
-      <w:r>
-        <w:t xml:space="preserve">8 (4): 355–62.</w:t>
+        <w:t xml:space="preserve">,</w:t>
+      </w:r>
+      <w:r>
+        <w:t xml:space="preserve"> </w:t>
+      </w:r>
+      <w:r>
+        <w:rPr>
+          <w:i/>
+          <w:iCs/>
+        </w:rPr>
+        <w:t xml:space="preserve">8</w:t>
+      </w:r>
+      <w:r>
+        <w:t xml:space="preserve">(4), 355–362.</w:t>
       </w:r>
       <w:r>
         <w:t xml:space="preserve"> </w:t>
@@ -5604,9 +5613,6 @@
           <w:t xml:space="preserve">https://doi.org/10.1177/1948550617697177</w:t>
         </w:r>
       </w:hyperlink>
-      <w:r>
-        <w:t xml:space="preserve">.</w:t>
-      </w:r>
     </w:p>
     <w:bookmarkEnd w:id="40"/>
     <w:bookmarkStart w:id="42" w:name="ref-lintz2021libra"/>
@@ -5615,13 +5621,7 @@
         <w:pStyle w:val="Bibliography"/>
       </w:pPr>
       <w:r>
-        <w:t xml:space="preserve">Lintz, Evan N., Phui Cheng Lim, and Matthew R. Johnson. 2021.</w:t>
-      </w:r>
-      <w:r>
-        <w:t xml:space="preserve"> </w:t>
-      </w:r>
-      <w:r>
-        <w:t xml:space="preserve">“A New Tool for Equating Lexical Stimuli Across Experimental Conditions.”</w:t>
+        <w:t xml:space="preserve">Lintz, E. N., Lim, P. C., &amp; Johnson, M. R. (2021). A new tool for equating lexical stimuli across experimental conditions.</w:t>
       </w:r>
       <w:r>
         <w:t xml:space="preserve"> </w:t>
@@ -5634,10 +5634,20 @@
         <w:t xml:space="preserve">MethodsX</w:t>
       </w:r>
       <w:r>
-        <w:t xml:space="preserve"> </w:t>
-      </w:r>
-      <w:r>
-        <w:t xml:space="preserve">8: 101545.</w:t>
+        <w:t xml:space="preserve">,</w:t>
+      </w:r>
+      <w:r>
+        <w:t xml:space="preserve"> </w:t>
+      </w:r>
+      <w:r>
+        <w:rPr>
+          <w:i/>
+          <w:iCs/>
+        </w:rPr>
+        <w:t xml:space="preserve">8</w:t>
+      </w:r>
+      <w:r>
+        <w:t xml:space="preserve">, 101545.</w:t>
       </w:r>
       <w:r>
         <w:t xml:space="preserve"> </w:t>
@@ -5650,9 +5660,6 @@
           <w:t xml:space="preserve">https://doi.org/10.1016/j.mex.2021.101545</w:t>
         </w:r>
       </w:hyperlink>
-      <w:r>
-        <w:t xml:space="preserve">.</w:t>
-      </w:r>
     </w:p>
     <w:bookmarkEnd w:id="42"/>
     <w:bookmarkStart w:id="44" w:name="ref-mathot2012opensesame"/>
@@ -5661,19 +5668,16 @@
         <w:pStyle w:val="Bibliography"/>
       </w:pPr>
       <w:r>
-        <w:t xml:space="preserve">Mathôt, Sebastiaan, Daniel Schreij, and Jan Theeuwes. 2012.</w:t>
-      </w:r>
-      <w:r>
-        <w:t xml:space="preserve"> </w:t>
-      </w:r>
-      <w:r>
-        <w:t xml:space="preserve">“</w:t>
+        <w:t xml:space="preserve">Mathôt, S., Schreij, D., &amp; Theeuwes, J. (2012).</w:t>
+      </w:r>
+      <w:r>
+        <w:t xml:space="preserve"> </w:t>
       </w:r>
       <w:r>
         <w:t xml:space="preserve">OpenSesame</w:t>
       </w:r>
       <w:r>
-        <w:t xml:space="preserve">: An Open-Source, Graphical Experiment Builder for the Social Sciences.”</w:t>
+        <w:t xml:space="preserve">: An open-source, graphical experiment builder for the social sciences.</w:t>
       </w:r>
       <w:r>
         <w:t xml:space="preserve"> </w:t>
@@ -5686,10 +5690,20 @@
         <w:t xml:space="preserve">Behavior Research Methods</w:t>
       </w:r>
       <w:r>
-        <w:t xml:space="preserve"> </w:t>
-      </w:r>
-      <w:r>
-        <w:t xml:space="preserve">44 (2): 314–24.</w:t>
+        <w:t xml:space="preserve">,</w:t>
+      </w:r>
+      <w:r>
+        <w:t xml:space="preserve"> </w:t>
+      </w:r>
+      <w:r>
+        <w:rPr>
+          <w:i/>
+          <w:iCs/>
+        </w:rPr>
+        <w:t xml:space="preserve">44</w:t>
+      </w:r>
+      <w:r>
+        <w:t xml:space="preserve">(2), 314–324.</w:t>
       </w:r>
       <w:r>
         <w:t xml:space="preserve"> </w:t>
@@ -5702,9 +5716,6 @@
           <w:t xml:space="preserve">https://doi.org/10.3758/s13428-011-0168-7</w:t>
         </w:r>
       </w:hyperlink>
-      <w:r>
-        <w:t xml:space="preserve">.</w:t>
-      </w:r>
     </w:p>
     <w:bookmarkEnd w:id="44"/>
     <w:bookmarkStart w:id="46" w:name="ref-peirce2019psychopy2"/>
@@ -5713,19 +5724,16 @@
         <w:pStyle w:val="Bibliography"/>
       </w:pPr>
       <w:r>
-        <w:t xml:space="preserve">Peirce, Jonathan, Jeremy R. Gray, Sol Simpson, et al. 2019.</w:t>
-      </w:r>
-      <w:r>
-        <w:t xml:space="preserve"> </w:t>
-      </w:r>
-      <w:r>
-        <w:t xml:space="preserve">“</w:t>
+        <w:t xml:space="preserve">Peirce, J., Gray, J. R., Simpson, S., MacAskill, M., Höchenberger, R., Sogo, H., Kastman, E., &amp; Lindeløv, J. K. (2019).</w:t>
+      </w:r>
+      <w:r>
+        <w:t xml:space="preserve"> </w:t>
       </w:r>
       <w:r>
         <w:t xml:space="preserve">PsychoPy2</w:t>
       </w:r>
       <w:r>
-        <w:t xml:space="preserve">: Experiments in Behavior Made Easy.”</w:t>
+        <w:t xml:space="preserve">: Experiments in behavior made easy.</w:t>
       </w:r>
       <w:r>
         <w:t xml:space="preserve"> </w:t>
@@ -5738,10 +5746,20 @@
         <w:t xml:space="preserve">Behavior Research Methods</w:t>
       </w:r>
       <w:r>
-        <w:t xml:space="preserve"> </w:t>
-      </w:r>
-      <w:r>
-        <w:t xml:space="preserve">51 (1): 195–203.</w:t>
+        <w:t xml:space="preserve">,</w:t>
+      </w:r>
+      <w:r>
+        <w:t xml:space="preserve"> </w:t>
+      </w:r>
+      <w:r>
+        <w:rPr>
+          <w:i/>
+          <w:iCs/>
+        </w:rPr>
+        <w:t xml:space="preserve">51</w:t>
+      </w:r>
+      <w:r>
+        <w:t xml:space="preserve">(1), 195–203.</w:t>
       </w:r>
       <w:r>
         <w:t xml:space="preserve"> </w:t>
@@ -5754,9 +5772,6 @@
           <w:t xml:space="preserve">https://doi.org/10.3758/s13428-018-01193-y</w:t>
         </w:r>
       </w:hyperlink>
-      <w:r>
-        <w:t xml:space="preserve">.</w:t>
-      </w:r>
     </w:p>
     <w:bookmarkEnd w:id="46"/>
     <w:bookmarkStart w:id="48" w:name="ref-speer2022wordfreq"/>
@@ -5765,7 +5780,7 @@
         <w:pStyle w:val="Bibliography"/>
       </w:pPr>
       <w:r>
-        <w:t xml:space="preserve">Speer, Robyn. 2022.</w:t>
+        <w:t xml:space="preserve">Speer, R. (2022).</w:t>
       </w:r>
       <w:r>
         <w:t xml:space="preserve"> </w:t>
@@ -5782,7 +5797,7 @@
           <w:i/>
           <w:iCs/>
         </w:rPr>
-        <w:t xml:space="preserve">: V3.0</w:t>
+        <w:t xml:space="preserve">: v3.0</w:t>
       </w:r>
       <w:r>
         <w:t xml:space="preserve">. Zenodo.</w:t>
@@ -5798,9 +5813,6 @@
           <w:t xml:space="preserve">https://doi.org/10.5281/zenodo.7199437</w:t>
         </w:r>
       </w:hyperlink>
-      <w:r>
-        <w:t xml:space="preserve">.</w:t>
-      </w:r>
     </w:p>
     <w:bookmarkEnd w:id="48"/>
     <w:bookmarkStart w:id="50" w:name="ref-taylor2020lexops"/>
@@ -5809,13 +5821,10 @@
         <w:pStyle w:val="Bibliography"/>
       </w:pPr>
       <w:r>
-        <w:t xml:space="preserve">Taylor, Jack E., Alistair Beith, and Sara C. Sereno. 2020.</w:t>
-      </w:r>
-      <w:r>
-        <w:t xml:space="preserve"> </w:t>
-      </w:r>
-      <w:r>
-        <w:t xml:space="preserve">“</w:t>
+        <w:t xml:space="preserve">Taylor, J. E., Beith, A., &amp; Sereno, S. C. (2020).</w:t>
+      </w:r>
+      <w:r>
+        <w:t xml:space="preserve"> </w:t>
       </w:r>
       <w:r>
         <w:t xml:space="preserve">LexOPS</w:t>
@@ -5833,7 +5842,7 @@
         <w:t xml:space="preserve"> </w:t>
       </w:r>
       <w:r>
-        <w:t xml:space="preserve">Package and User Interface for the Controlled Generation of Word Stimuli.”</w:t>
+        <w:t xml:space="preserve">package and user interface for the controlled generation of word stimuli.</w:t>
       </w:r>
       <w:r>
         <w:t xml:space="preserve"> </w:t>
@@ -5846,10 +5855,20 @@
         <w:t xml:space="preserve">Behavior Research Methods</w:t>
       </w:r>
       <w:r>
-        <w:t xml:space="preserve"> </w:t>
-      </w:r>
-      <w:r>
-        <w:t xml:space="preserve">52 (6): 2372–82.</w:t>
+        <w:t xml:space="preserve">,</w:t>
+      </w:r>
+      <w:r>
+        <w:t xml:space="preserve"> </w:t>
+      </w:r>
+      <w:r>
+        <w:rPr>
+          <w:i/>
+          <w:iCs/>
+        </w:rPr>
+        <w:t xml:space="preserve">52</w:t>
+      </w:r>
+      <w:r>
+        <w:t xml:space="preserve">(6), 2372–2382.</w:t>
       </w:r>
       <w:r>
         <w:t xml:space="preserve"> </w:t>
@@ -5862,9 +5881,6 @@
           <w:t xml:space="preserve">https://doi.org/10.3758/s13428-020-01389-1</w:t>
         </w:r>
       </w:hyperlink>
-      <w:r>
-        <w:t xml:space="preserve">.</w:t>
-      </w:r>
     </w:p>
     <w:bookmarkEnd w:id="50"/>
     <w:bookmarkStart w:id="52" w:name="ref-wilkinson2016fair"/>
@@ -5873,16 +5889,10 @@
         <w:pStyle w:val="Bibliography"/>
       </w:pPr>
       <w:r>
-        <w:t xml:space="preserve">Wilkinson, Mark D., Michel Dumontier, IJsbrand Jan Aalbersberg, et al.</w:t>
-      </w:r>
-      <w:r>
-        <w:t xml:space="preserve"> 2016.</w:t>
-      </w:r>
-      <w:r>
-        <w:t xml:space="preserve"> </w:t>
-      </w:r>
-      <w:r>
-        <w:t xml:space="preserve">“The</w:t>
+        <w:t xml:space="preserve">Wilkinson, M. D., Dumontier, M., Aalbersberg, Ij. J., et al.</w:t>
+      </w:r>
+      <w:r>
+        <w:t xml:space="preserve"> (2016). The</w:t>
       </w:r>
       <w:r>
         <w:t xml:space="preserve"> </w:t>
@@ -5894,7 +5904,7 @@
         <w:t xml:space="preserve"> </w:t>
       </w:r>
       <w:r>
-        <w:t xml:space="preserve">Guiding Principles for Scientific Data Management and Stewardship.”</w:t>
+        <w:t xml:space="preserve">guiding principles for scientific data management and stewardship.</w:t>
       </w:r>
       <w:r>
         <w:t xml:space="preserve"> </w:t>
@@ -5907,10 +5917,20 @@
         <w:t xml:space="preserve">Scientific Data</w:t>
       </w:r>
       <w:r>
-        <w:t xml:space="preserve"> </w:t>
-      </w:r>
-      <w:r>
-        <w:t xml:space="preserve">3: 160018.</w:t>
+        <w:t xml:space="preserve">,</w:t>
+      </w:r>
+      <w:r>
+        <w:t xml:space="preserve"> </w:t>
+      </w:r>
+      <w:r>
+        <w:rPr>
+          <w:i/>
+          <w:iCs/>
+        </w:rPr>
+        <w:t xml:space="preserve">3</w:t>
+      </w:r>
+      <w:r>
+        <w:t xml:space="preserve">, 160018.</w:t>
       </w:r>
       <w:r>
         <w:t xml:space="preserve"> </w:t>
@@ -5923,9 +5943,6 @@
           <w:t xml:space="preserve">https://doi.org/10.1038/sdata.2016.18</w:t>
         </w:r>
       </w:hyperlink>
-      <w:r>
-        <w:t xml:space="preserve">.</w:t>
-      </w:r>
     </w:p>
     <w:bookmarkEnd w:id="52"/>
     <w:bookmarkStart w:id="54" w:name="ref-yarkoni2008old20"/>
@@ -5934,13 +5951,7 @@
         <w:pStyle w:val="Bibliography"/>
       </w:pPr>
       <w:r>
-        <w:t xml:space="preserve">Yarkoni, Tal, David Balota, and Melvin Yap. 2008.</w:t>
-      </w:r>
-      <w:r>
-        <w:t xml:space="preserve"> </w:t>
-      </w:r>
-      <w:r>
-        <w:t xml:space="preserve">“Moving Beyond</w:t>
+        <w:t xml:space="preserve">Yarkoni, T., Balota, D., &amp; Yap, M. (2008). Moving beyond</w:t>
       </w:r>
       <w:r>
         <w:t xml:space="preserve"> </w:t>
@@ -5955,7 +5966,7 @@
         <w:t xml:space="preserve">N</w:t>
       </w:r>
       <w:r>
-        <w:t xml:space="preserve">: A New Measure of Orthographic Similarity.”</w:t>
+        <w:t xml:space="preserve">: A new measure of orthographic similarity.</w:t>
       </w:r>
       <w:r>
         <w:t xml:space="preserve"> </w:t>
@@ -5968,10 +5979,20 @@
         <w:t xml:space="preserve">Psychonomic Bulletin &amp; Review</w:t>
       </w:r>
       <w:r>
-        <w:t xml:space="preserve"> </w:t>
-      </w:r>
-      <w:r>
-        <w:t xml:space="preserve">15 (5): 971–79.</w:t>
+        <w:t xml:space="preserve">,</w:t>
+      </w:r>
+      <w:r>
+        <w:t xml:space="preserve"> </w:t>
+      </w:r>
+      <w:r>
+        <w:rPr>
+          <w:i/>
+          <w:iCs/>
+        </w:rPr>
+        <w:t xml:space="preserve">15</w:t>
+      </w:r>
+      <w:r>
+        <w:t xml:space="preserve">(5), 971–979.</w:t>
       </w:r>
       <w:r>
         <w:t xml:space="preserve"> </w:t>
@@ -5984,9 +6005,6 @@
           <w:t xml:space="preserve">https://doi.org/10.3758/pbr.15.5.971</w:t>
         </w:r>
       </w:hyperlink>
-      <w:r>
-        <w:t xml:space="preserve">.</w:t>
-      </w:r>
     </w:p>
     <w:bookmarkEnd w:id="54"/>
     <w:bookmarkEnd w:id="55"/>

</xml_diff>

<commit_message>
Stop asserting Behavior Research Methods as the manuscript's venue
The manuscript has not been submitted, so nothing should state a journal
of record. Removed the premature venue from the citation metadata and docs:

- CITATION.cff: preferred-citation changed from a BRM journal article to
  type: unpublished with no journal ("manuscript in preparation").
- README.md: "manuscript for Behavior Research Methods" -> "(in preparation)".
- SUBMISSION.md: reframed so BRM is the candidate venue, not a decided one,
  and stated plainly that nothing has been submitted.

Legitimate BRM references to other works (Brysbaert, Duchon, Keuleers,
Peirce, Taylor, ...) are unchanged. Also fixed a stale count: the abstract
said "nine" worked examples while the body now has twelve (incl. the three
reproductions); re-rendered HTML/PDF/docx.

Co-Authored-By: Claude Opus 4.8 <noreply@anthropic.com>
</commit_message>
<xml_diff>
--- a/manuscript/manuscript.docx
+++ b/manuscript/manuscript.docx
@@ -201,7 +201,7 @@
         <w:t xml:space="preserve"> </w:t>
       </w:r>
       <w:r>
-        <w:t xml:space="preserve">this on nine worked examples in English, Spanish and Mandarin Chinese — across</w:t>
+        <w:t xml:space="preserve">this on twelve worked examples in English, Spanish and Mandarin Chinese — across</w:t>
       </w:r>
       <w:r>
         <w:t xml:space="preserve"> </w:t>
@@ -213,7 +213,13 @@
         <w:t xml:space="preserve"> </w:t>
       </w:r>
       <w:r>
-        <w:t xml:space="preserve">workflow extends to a logographic writing system. The</w:t>
+        <w:t xml:space="preserve">workflow extends to a logographic writing system, while three reproduce</w:t>
+      </w:r>
+      <w:r>
+        <w:t xml:space="preserve"> </w:t>
+      </w:r>
+      <w:r>
+        <w:t xml:space="preserve">published designs from the literature. The</w:t>
       </w:r>
       <w:r>
         <w:t xml:space="preserve"> </w:t>

</xml_diff>

<commit_message>
Add a variance-ratio distributional balance diagnostic
Report a variance ratio (condition variance / reference variance) per dimension
alongside Cohen's d and TOST, so the realised-control report also detects unequal
spread: two conditions can share a mean yet differ in variance and still confound
(Armstrong, Watson and Plaut, 2012; Austin, 2009).

- validation (both engines): new variance_ratio(); match_report adds a var_ratio
  column to the comparisons table.
- Surfaced in the datasheet (a Var ratio column in the realised-control table) and
  in the Streamlit and Shiny realised-control tables.
- Deterministic (a ratio of sample variances), so the cross-engine parity of the
  deterministic methods is unaffected.
- CHANGELOG/NEWS/manuscript updated; WORDLIST gains the new author names.

Gates: pytest 66; parity 13/13; R CMD check --as-cran 1 NOTE; R testthat 160;
manuscript renders HTML/PDF/docx.

Co-Authored-By: Claude Opus 4.8 <noreply@anthropic.com>
</commit_message>
<xml_diff>
--- a/manuscript/manuscript.docx
+++ b/manuscript/manuscript.docx
@@ -2246,7 +2246,13 @@
         <w:t xml:space="preserve"> </w:t>
       </w:r>
       <w:r>
-        <w:t xml:space="preserve">(the effect sizes, intervals and equivalence verdicts above), the counterbalancing</w:t>
+        <w:t xml:space="preserve">(the effect sizes and their intervals, a variance-ratio check on the spread, and the</w:t>
+      </w:r>
+      <w:r>
+        <w:t xml:space="preserve"> </w:t>
+      </w:r>
+      <w:r>
+        <w:t xml:space="preserve">equivalence verdicts), the counterbalancing</w:t>
       </w:r>
       <w:r>
         <w:t xml:space="preserve"> </w:t>

</xml_diff>